<commit_message>
fixing typos and adding summary 7
</commit_message>
<xml_diff>
--- a/ClimOO material/stakehoder engagement/meeting summaries/Meeting 1.docx
+++ b/ClimOO material/stakehoder engagement/meeting summaries/Meeting 1.docx
@@ -41,7 +41,7 @@
           <w:szCs w:val="22"/>
           <w:lang w:val="en-US"/>
         </w:rPr>
-        <w:t>This is the summary of the first meeting held with representative from institute A. The table</w:t>
+        <w:t>This is the summary of the first meeting held with representative</w:t>
       </w:r>
       <w:r>
         <w:rPr>
@@ -50,7 +50,43 @@
           <w:szCs w:val="22"/>
           <w:lang w:val="en-US"/>
         </w:rPr>
-        <w:t xml:space="preserve"> summarizes the purposes, main topics discussed, and outputs of the meetings</w:t>
+        <w:t>s</w:t>
+      </w:r>
+      <w:r>
+        <w:rPr>
+          <w:rFonts w:ascii="Calibri" w:hAnsi="Calibri" w:cs="Calibri"/>
+          <w:sz w:val="22"/>
+          <w:szCs w:val="22"/>
+          <w:lang w:val="en-US"/>
+        </w:rPr>
+        <w:t xml:space="preserve"> from </w:t>
+      </w:r>
+      <w:r>
+        <w:rPr>
+          <w:rFonts w:ascii="Calibri" w:hAnsi="Calibri" w:cs="Calibri"/>
+          <w:sz w:val="22"/>
+          <w:szCs w:val="22"/>
+          <w:lang w:val="en-US"/>
+        </w:rPr>
+        <w:t>I</w:t>
+      </w:r>
+      <w:r>
+        <w:rPr>
+          <w:rFonts w:ascii="Calibri" w:hAnsi="Calibri" w:cs="Calibri"/>
+          <w:sz w:val="22"/>
+          <w:szCs w:val="22"/>
+          <w:lang w:val="en-US"/>
+        </w:rPr>
+        <w:t>nstitute A. The table</w:t>
+      </w:r>
+      <w:r>
+        <w:rPr>
+          <w:rFonts w:ascii="Calibri" w:hAnsi="Calibri" w:cs="Calibri"/>
+          <w:sz w:val="22"/>
+          <w:szCs w:val="22"/>
+          <w:lang w:val="en-US"/>
+        </w:rPr>
+        <w:t xml:space="preserve"> summarizes the purposes, main topics discussed, and outputs of the meeting</w:t>
       </w:r>
       <w:r>
         <w:rPr>

</xml_diff>